<commit_message>
Fix LPA layout error
</commit_message>
<xml_diff>
--- a/client/templates/lay-person-abstract/lay-person-abstract-template.docx
+++ b/client/templates/lay-person-abstract/lay-person-abstract-template.docx
@@ -188,9 +188,7 @@
         <w:gridCol w:w="5820"/>
       </w:tblGrid>
       <w:tr>
-        <w:trPr>
-          <w:trHeight w:val="721"/>
-        </w:trPr>
+        <w:trPr/>
         <w:tc>
           <w:tcPr>
             <w:tcW w:w="11644" w:type="dxa"/>
@@ -406,9 +404,7 @@
         </w:tc>
       </w:tr>
       <w:tr>
-        <w:trPr>
-          <w:trHeight w:val="56"/>
-        </w:trPr>
+        <w:trPr/>
         <w:tc>
           <w:tcPr>
             <w:tcW w:w="11644" w:type="dxa"/>
@@ -434,9 +430,7 @@
         </w:tc>
       </w:tr>
       <w:tr>
-        <w:trPr>
-          <w:trHeight w:val="357"/>
-        </w:trPr>
+        <w:trPr/>
         <w:tc>
           <w:tcPr>
             <w:tcW w:w="5659" w:type="dxa"/>
@@ -541,7 +535,6 @@
       <w:tr>
         <w:trPr>
           <w:cantSplit/>
-          <w:trHeight w:hRule="exact" w:val="2664"/>
         </w:trPr>
         <w:tc>
           <w:tcPr>
@@ -958,9 +951,7 @@
         </w:tc>
       </w:tr>
       <w:tr>
-        <w:trPr>
-          <w:trHeight w:val="21"/>
-        </w:trPr>
+        <w:trPr/>
         <w:tc>
           <w:tcPr>
             <w:tcW w:w="5659" w:type="dxa"/>
@@ -1023,9 +1014,7 @@
         </w:tc>
       </w:tr>
       <w:tr>
-        <w:trPr>
-          <w:trHeight w:val="359"/>
-        </w:trPr>
+        <w:trPr/>
         <w:tc>
           <w:tcPr>
             <w:tcW w:w="5659" w:type="dxa"/>
@@ -1115,7 +1104,6 @@
       <w:tr>
         <w:trPr>
           <w:cantSplit/>
-          <w:trHeight w:hRule="exact" w:val="2664"/>
         </w:trPr>
         <w:tc>
           <w:tcPr>
@@ -1455,9 +1443,7 @@
         </w:tc>
       </w:tr>
       <w:tr>
-        <w:trPr>
-          <w:trHeight w:val="34"/>
-        </w:trPr>
+        <w:trPr/>
         <w:tc>
           <w:tcPr>
             <w:tcW w:w="5659" w:type="dxa"/>
@@ -1520,9 +1506,7 @@
         </w:tc>
       </w:tr>
       <w:tr>
-        <w:trPr>
-          <w:trHeight w:val="357"/>
-        </w:trPr>
+        <w:trPr/>
         <w:tc>
           <w:tcPr>
             <w:tcW w:w="5659" w:type="dxa"/>
@@ -1609,7 +1593,6 @@
       <w:tr>
         <w:trPr>
           <w:cantSplit/>
-          <w:trHeight w:hRule="exact" w:val="2664"/>
         </w:trPr>
         <w:tc>
           <w:tcPr>
@@ -2053,9 +2036,7 @@
         </w:tc>
       </w:tr>
       <w:tr>
-        <w:trPr>
-          <w:trHeight w:val="21"/>
-        </w:trPr>
+        <w:trPr/>
         <w:tc>
           <w:tcPr>
             <w:tcW w:w="5659" w:type="dxa"/>
@@ -2118,9 +2099,7 @@
         </w:tc>
       </w:tr>
       <w:tr>
-        <w:trPr>
-          <w:trHeight w:val="360"/>
-        </w:trPr>
+        <w:trPr/>
         <w:tc>
           <w:tcPr>
             <w:tcW w:w="5659" w:type="dxa"/>
@@ -2218,7 +2197,6 @@
       <w:tr>
         <w:trPr>
           <w:cantSplit/>
-          <w:trHeight w:hRule="exact" w:val="2664"/>
         </w:trPr>
         <w:tc>
           <w:tcPr>
@@ -2595,9 +2573,7 @@
         </w:tc>
       </w:tr>
       <w:tr>
-        <w:trPr>
-          <w:trHeight w:val="366"/>
-        </w:trPr>
+        <w:trPr/>
         <w:tc>
           <w:tcPr>
             <w:tcW w:w="11644" w:type="dxa"/>

</xml_diff>